<commit_message>
cambios a los casos de uso y requisitos
</commit_message>
<xml_diff>
--- a/EduMultiPro 1 Parte/5) Casos de Uso EduMultiPro/uml.docx
+++ b/EduMultiPro 1 Parte/5) Casos de Uso EduMultiPro/uml.docx
@@ -1011,6 +1011,16 @@
           <w:szCs w:val="24"/>
         </w:rPr>
       </w:pPr>
+    </w:p>
+    <w:p>
+      <w:pPr>
+        <w:jc w:val="both"/>
+        <w:rPr>
+          <w:rFonts w:ascii="Times New Roman" w:hAnsi="Times New Roman" w:cs="Times New Roman"/>
+          <w:sz w:val="24"/>
+          <w:szCs w:val="24"/>
+        </w:rPr>
+      </w:pPr>
       <w:r>
         <w:rPr>
           <w:rFonts w:ascii="Times New Roman" w:hAnsi="Times New Roman" w:cs="Times New Roman"/>
@@ -1019,18 +1029,10 @@
           <w:szCs w:val="24"/>
         </w:rPr>
         <w:drawing>
-          <wp:anchor distT="0" distB="0" distL="114300" distR="114300" simplePos="0" relativeHeight="251665408" behindDoc="0" locked="0" layoutInCell="1" allowOverlap="1" wp14:anchorId="5C894876" wp14:editId="24DE7D3A">
-            <wp:simplePos x="0" y="0"/>
-            <wp:positionH relativeFrom="margin">
-              <wp:align>right</wp:align>
-            </wp:positionH>
-            <wp:positionV relativeFrom="paragraph">
-              <wp:posOffset>-636</wp:posOffset>
-            </wp:positionV>
-            <wp:extent cx="5612130" cy="5133975"/>
+          <wp:inline distT="0" distB="0" distL="0" distR="0" wp14:anchorId="4C229D58" wp14:editId="578C2A9D">
+            <wp:extent cx="5612130" cy="4448175"/>
             <wp:effectExtent l="0" t="0" r="7620" b="9525"/>
-            <wp:wrapNone/>
-            <wp:docPr id="9" name="Imagen 9"/>
+            <wp:docPr id="1" name="Imagen 1"/>
             <wp:cNvGraphicFramePr>
               <a:graphicFrameLocks xmlns:a="http://schemas.openxmlformats.org/drawingml/2006/main" noChangeAspect="1"/>
             </wp:cNvGraphicFramePr>
@@ -1038,7 +1040,7 @@
               <a:graphicData uri="http://schemas.openxmlformats.org/drawingml/2006/picture">
                 <pic:pic xmlns:pic="http://schemas.openxmlformats.org/drawingml/2006/picture">
                   <pic:nvPicPr>
-                    <pic:cNvPr id="9" name="Imagen 9"/>
+                    <pic:cNvPr id="1" name="Imagen 1"/>
                     <pic:cNvPicPr/>
                   </pic:nvPicPr>
                   <pic:blipFill>
@@ -1056,7 +1058,7 @@
                   <pic:spPr>
                     <a:xfrm>
                       <a:off x="0" y="0"/>
-                      <a:ext cx="5612130" cy="5133975"/>
+                      <a:ext cx="5612130" cy="4448175"/>
                     </a:xfrm>
                     <a:prstGeom prst="rect">
                       <a:avLst/>
@@ -1065,188 +1067,12 @@
                 </pic:pic>
               </a:graphicData>
             </a:graphic>
-            <wp14:sizeRelH relativeFrom="page">
-              <wp14:pctWidth>0</wp14:pctWidth>
-            </wp14:sizeRelH>
-            <wp14:sizeRelV relativeFrom="page">
-              <wp14:pctHeight>0</wp14:pctHeight>
-            </wp14:sizeRelV>
-          </wp:anchor>
+          </wp:inline>
         </w:drawing>
       </w:r>
     </w:p>
     <w:p>
       <w:pPr>
-        <w:jc w:val="both"/>
-        <w:rPr>
-          <w:rFonts w:ascii="Times New Roman" w:hAnsi="Times New Roman" w:cs="Times New Roman"/>
-          <w:sz w:val="24"/>
-          <w:szCs w:val="24"/>
-        </w:rPr>
-      </w:pPr>
-    </w:p>
-    <w:p>
-      <w:pPr>
-        <w:jc w:val="both"/>
-        <w:rPr>
-          <w:rFonts w:ascii="Times New Roman" w:hAnsi="Times New Roman" w:cs="Times New Roman"/>
-          <w:sz w:val="24"/>
-          <w:szCs w:val="24"/>
-        </w:rPr>
-      </w:pPr>
-    </w:p>
-    <w:p>
-      <w:pPr>
-        <w:jc w:val="both"/>
-        <w:rPr>
-          <w:rFonts w:ascii="Times New Roman" w:hAnsi="Times New Roman" w:cs="Times New Roman"/>
-          <w:sz w:val="24"/>
-          <w:szCs w:val="24"/>
-        </w:rPr>
-      </w:pPr>
-    </w:p>
-    <w:p>
-      <w:pPr>
-        <w:jc w:val="both"/>
-        <w:rPr>
-          <w:rFonts w:ascii="Times New Roman" w:hAnsi="Times New Roman" w:cs="Times New Roman"/>
-          <w:sz w:val="24"/>
-          <w:szCs w:val="24"/>
-        </w:rPr>
-      </w:pPr>
-    </w:p>
-    <w:p>
-      <w:pPr>
-        <w:jc w:val="both"/>
-        <w:rPr>
-          <w:rFonts w:ascii="Times New Roman" w:hAnsi="Times New Roman" w:cs="Times New Roman"/>
-          <w:sz w:val="24"/>
-          <w:szCs w:val="24"/>
-        </w:rPr>
-      </w:pPr>
-    </w:p>
-    <w:p>
-      <w:pPr>
-        <w:jc w:val="both"/>
-        <w:rPr>
-          <w:rFonts w:ascii="Times New Roman" w:hAnsi="Times New Roman" w:cs="Times New Roman"/>
-          <w:sz w:val="24"/>
-          <w:szCs w:val="24"/>
-        </w:rPr>
-      </w:pPr>
-    </w:p>
-    <w:p>
-      <w:pPr>
-        <w:jc w:val="both"/>
-        <w:rPr>
-          <w:rFonts w:ascii="Times New Roman" w:hAnsi="Times New Roman" w:cs="Times New Roman"/>
-          <w:sz w:val="24"/>
-          <w:szCs w:val="24"/>
-        </w:rPr>
-      </w:pPr>
-    </w:p>
-    <w:p>
-      <w:pPr>
-        <w:jc w:val="both"/>
-        <w:rPr>
-          <w:rFonts w:ascii="Times New Roman" w:hAnsi="Times New Roman" w:cs="Times New Roman"/>
-          <w:sz w:val="24"/>
-          <w:szCs w:val="24"/>
-        </w:rPr>
-      </w:pPr>
-    </w:p>
-    <w:p>
-      <w:pPr>
-        <w:jc w:val="both"/>
-        <w:rPr>
-          <w:rFonts w:ascii="Times New Roman" w:hAnsi="Times New Roman" w:cs="Times New Roman"/>
-          <w:sz w:val="24"/>
-          <w:szCs w:val="24"/>
-        </w:rPr>
-      </w:pPr>
-    </w:p>
-    <w:p>
-      <w:pPr>
-        <w:jc w:val="both"/>
-        <w:rPr>
-          <w:rFonts w:ascii="Times New Roman" w:hAnsi="Times New Roman" w:cs="Times New Roman"/>
-          <w:sz w:val="24"/>
-          <w:szCs w:val="24"/>
-        </w:rPr>
-      </w:pPr>
-    </w:p>
-    <w:p>
-      <w:pPr>
-        <w:jc w:val="both"/>
-        <w:rPr>
-          <w:rFonts w:ascii="Times New Roman" w:hAnsi="Times New Roman" w:cs="Times New Roman"/>
-          <w:sz w:val="24"/>
-          <w:szCs w:val="24"/>
-        </w:rPr>
-      </w:pPr>
-    </w:p>
-    <w:p>
-      <w:pPr>
-        <w:jc w:val="both"/>
-        <w:rPr>
-          <w:rFonts w:ascii="Times New Roman" w:hAnsi="Times New Roman" w:cs="Times New Roman"/>
-          <w:sz w:val="24"/>
-          <w:szCs w:val="24"/>
-        </w:rPr>
-      </w:pPr>
-    </w:p>
-    <w:p>
-      <w:pPr>
-        <w:jc w:val="both"/>
-        <w:rPr>
-          <w:rFonts w:ascii="Times New Roman" w:hAnsi="Times New Roman" w:cs="Times New Roman"/>
-          <w:sz w:val="24"/>
-          <w:szCs w:val="24"/>
-        </w:rPr>
-      </w:pPr>
-    </w:p>
-    <w:p>
-      <w:pPr>
-        <w:jc w:val="both"/>
-        <w:rPr>
-          <w:rFonts w:ascii="Times New Roman" w:hAnsi="Times New Roman" w:cs="Times New Roman"/>
-          <w:sz w:val="24"/>
-          <w:szCs w:val="24"/>
-        </w:rPr>
-      </w:pPr>
-    </w:p>
-    <w:p>
-      <w:pPr>
-        <w:jc w:val="both"/>
-        <w:rPr>
-          <w:rFonts w:ascii="Times New Roman" w:hAnsi="Times New Roman" w:cs="Times New Roman"/>
-          <w:sz w:val="24"/>
-          <w:szCs w:val="24"/>
-        </w:rPr>
-      </w:pPr>
-    </w:p>
-    <w:p>
-      <w:pPr>
-        <w:jc w:val="both"/>
-        <w:rPr>
-          <w:rFonts w:ascii="Times New Roman" w:hAnsi="Times New Roman" w:cs="Times New Roman"/>
-          <w:sz w:val="24"/>
-          <w:szCs w:val="24"/>
-        </w:rPr>
-      </w:pPr>
-    </w:p>
-    <w:p>
-      <w:pPr>
-        <w:jc w:val="both"/>
-        <w:rPr>
-          <w:rFonts w:ascii="Times New Roman" w:hAnsi="Times New Roman" w:cs="Times New Roman"/>
-          <w:sz w:val="24"/>
-          <w:szCs w:val="24"/>
-        </w:rPr>
-      </w:pPr>
-    </w:p>
-    <w:p>
-      <w:pPr>
         <w:jc w:val="center"/>
         <w:rPr>
           <w:rFonts w:ascii="Times New Roman" w:hAnsi="Times New Roman" w:cs="Times New Roman"/>
@@ -1268,6 +1094,32 @@
         </w:rPr>
         <w:t>Figura 1.</w:t>
       </w:r>
+    </w:p>
+    <w:p>
+      <w:pPr>
+        <w:jc w:val="center"/>
+        <w:rPr>
+          <w:rFonts w:ascii="Times New Roman" w:hAnsi="Times New Roman" w:cs="Times New Roman"/>
+          <w:b/>
+          <w:bCs/>
+          <w:color w:val="0070C0"/>
+          <w:sz w:val="24"/>
+          <w:szCs w:val="24"/>
+        </w:rPr>
+      </w:pPr>
+    </w:p>
+    <w:p>
+      <w:pPr>
+        <w:jc w:val="center"/>
+        <w:rPr>
+          <w:rFonts w:ascii="Times New Roman" w:hAnsi="Times New Roman" w:cs="Times New Roman"/>
+          <w:b/>
+          <w:bCs/>
+          <w:color w:val="0070C0"/>
+          <w:sz w:val="24"/>
+          <w:szCs w:val="24"/>
+        </w:rPr>
+      </w:pPr>
     </w:p>
     <w:p>
       <w:pPr>
@@ -1308,7 +1160,6 @@
           <w:sz w:val="44"/>
           <w:szCs w:val="44"/>
         </w:rPr>
-        <w:lastRenderedPageBreak/>
         <w:t>5.0-</w:t>
       </w:r>
       <w:r>
@@ -1357,6 +1208,16 @@
           <w:szCs w:val="24"/>
         </w:rPr>
       </w:pPr>
+    </w:p>
+    <w:p>
+      <w:pPr>
+        <w:jc w:val="both"/>
+        <w:rPr>
+          <w:rFonts w:ascii="Times New Roman" w:hAnsi="Times New Roman" w:cs="Times New Roman"/>
+          <w:sz w:val="24"/>
+          <w:szCs w:val="24"/>
+        </w:rPr>
+      </w:pPr>
       <w:r>
         <w:rPr>
           <w:rFonts w:ascii="Times New Roman" w:hAnsi="Times New Roman" w:cs="Times New Roman"/>
@@ -1365,10 +1226,10 @@
           <w:szCs w:val="24"/>
         </w:rPr>
         <w:drawing>
-          <wp:inline distT="0" distB="0" distL="0" distR="0" wp14:anchorId="61A88B2D" wp14:editId="26A78825">
-            <wp:extent cx="5612130" cy="5772150"/>
-            <wp:effectExtent l="0" t="0" r="7620" b="0"/>
-            <wp:docPr id="10" name="Imagen 10"/>
+          <wp:inline distT="0" distB="0" distL="0" distR="0" wp14:anchorId="00EC7A53" wp14:editId="37BECF6C">
+            <wp:extent cx="5943600" cy="5419725"/>
+            <wp:effectExtent l="0" t="0" r="0" b="9525"/>
+            <wp:docPr id="2" name="Imagen 2"/>
             <wp:cNvGraphicFramePr>
               <a:graphicFrameLocks xmlns:a="http://schemas.openxmlformats.org/drawingml/2006/main" noChangeAspect="1"/>
             </wp:cNvGraphicFramePr>
@@ -1376,7 +1237,7 @@
               <a:graphicData uri="http://schemas.openxmlformats.org/drawingml/2006/picture">
                 <pic:pic xmlns:pic="http://schemas.openxmlformats.org/drawingml/2006/picture">
                   <pic:nvPicPr>
-                    <pic:cNvPr id="10" name="Imagen 10"/>
+                    <pic:cNvPr id="2" name="Imagen 2"/>
                     <pic:cNvPicPr/>
                   </pic:nvPicPr>
                   <pic:blipFill>
@@ -1394,7 +1255,7 @@
                   <pic:spPr>
                     <a:xfrm>
                       <a:off x="0" y="0"/>
-                      <a:ext cx="5612130" cy="5772150"/>
+                      <a:ext cx="5943600" cy="5419725"/>
                     </a:xfrm>
                     <a:prstGeom prst="rect">
                       <a:avLst/>
@@ -1416,66 +1277,6 @@
           <w:szCs w:val="24"/>
         </w:rPr>
       </w:pPr>
-    </w:p>
-    <w:p>
-      <w:pPr>
-        <w:jc w:val="both"/>
-        <w:rPr>
-          <w:rFonts w:ascii="Times New Roman" w:hAnsi="Times New Roman" w:cs="Times New Roman"/>
-          <w:sz w:val="24"/>
-          <w:szCs w:val="24"/>
-        </w:rPr>
-      </w:pPr>
-    </w:p>
-    <w:p>
-      <w:pPr>
-        <w:jc w:val="both"/>
-        <w:rPr>
-          <w:rFonts w:ascii="Times New Roman" w:hAnsi="Times New Roman" w:cs="Times New Roman"/>
-          <w:sz w:val="24"/>
-          <w:szCs w:val="24"/>
-        </w:rPr>
-      </w:pPr>
-    </w:p>
-    <w:p>
-      <w:pPr>
-        <w:jc w:val="both"/>
-        <w:rPr>
-          <w:rFonts w:ascii="Times New Roman" w:hAnsi="Times New Roman" w:cs="Times New Roman"/>
-          <w:sz w:val="24"/>
-          <w:szCs w:val="24"/>
-        </w:rPr>
-      </w:pPr>
-    </w:p>
-    <w:p>
-      <w:pPr>
-        <w:jc w:val="both"/>
-        <w:rPr>
-          <w:rFonts w:ascii="Times New Roman" w:hAnsi="Times New Roman" w:cs="Times New Roman"/>
-          <w:sz w:val="24"/>
-          <w:szCs w:val="24"/>
-        </w:rPr>
-      </w:pPr>
-    </w:p>
-    <w:p>
-      <w:pPr>
-        <w:jc w:val="both"/>
-        <w:rPr>
-          <w:rFonts w:ascii="Times New Roman" w:hAnsi="Times New Roman" w:cs="Times New Roman"/>
-          <w:sz w:val="24"/>
-          <w:szCs w:val="24"/>
-        </w:rPr>
-      </w:pPr>
-    </w:p>
-    <w:p>
-      <w:pPr>
-        <w:jc w:val="both"/>
-        <w:rPr>
-          <w:rFonts w:ascii="Times New Roman" w:hAnsi="Times New Roman" w:cs="Times New Roman"/>
-          <w:sz w:val="24"/>
-          <w:szCs w:val="24"/>
-        </w:rPr>
-      </w:pPr>
       <w:r>
         <w:rPr>
           <w:rFonts w:ascii="Times New Roman" w:hAnsi="Times New Roman" w:cs="Times New Roman"/>
@@ -1483,11 +1284,12 @@
           <w:sz w:val="24"/>
           <w:szCs w:val="24"/>
         </w:rPr>
+        <w:lastRenderedPageBreak/>
         <w:drawing>
-          <wp:inline distT="0" distB="0" distL="0" distR="0" wp14:anchorId="3E1AB081" wp14:editId="31C5EA76">
-            <wp:extent cx="5848350" cy="6076950"/>
+          <wp:inline distT="0" distB="0" distL="0" distR="0" wp14:anchorId="46741017" wp14:editId="2CAC4E26">
+            <wp:extent cx="5829300" cy="3562350"/>
             <wp:effectExtent l="0" t="0" r="0" b="0"/>
-            <wp:docPr id="11" name="Imagen 11"/>
+            <wp:docPr id="3" name="Imagen 3"/>
             <wp:cNvGraphicFramePr>
               <a:graphicFrameLocks xmlns:a="http://schemas.openxmlformats.org/drawingml/2006/main" noChangeAspect="1"/>
             </wp:cNvGraphicFramePr>
@@ -1495,7 +1297,7 @@
               <a:graphicData uri="http://schemas.openxmlformats.org/drawingml/2006/picture">
                 <pic:pic xmlns:pic="http://schemas.openxmlformats.org/drawingml/2006/picture">
                   <pic:nvPicPr>
-                    <pic:cNvPr id="11" name="Imagen 11"/>
+                    <pic:cNvPr id="3" name="Imagen 3"/>
                     <pic:cNvPicPr/>
                   </pic:nvPicPr>
                   <pic:blipFill>
@@ -1513,7 +1315,7 @@
                   <pic:spPr>
                     <a:xfrm>
                       <a:off x="0" y="0"/>
-                      <a:ext cx="5848350" cy="6076950"/>
+                      <a:ext cx="5829300" cy="3562350"/>
                     </a:xfrm>
                     <a:prstGeom prst="rect">
                       <a:avLst/>
@@ -1525,16 +1327,6 @@
           </wp:inline>
         </w:drawing>
       </w:r>
-    </w:p>
-    <w:p>
-      <w:pPr>
-        <w:jc w:val="both"/>
-        <w:rPr>
-          <w:rFonts w:ascii="Times New Roman" w:hAnsi="Times New Roman" w:cs="Times New Roman"/>
-          <w:sz w:val="24"/>
-          <w:szCs w:val="24"/>
-        </w:rPr>
-      </w:pPr>
       <w:r>
         <w:rPr>
           <w:rFonts w:ascii="Times New Roman" w:hAnsi="Times New Roman" w:cs="Times New Roman"/>
@@ -1542,12 +1334,11 @@
           <w:sz w:val="24"/>
           <w:szCs w:val="24"/>
         </w:rPr>
-        <w:lastRenderedPageBreak/>
         <w:drawing>
-          <wp:inline distT="0" distB="0" distL="0" distR="0" wp14:anchorId="79AF3E27" wp14:editId="29BC04A6">
-            <wp:extent cx="5612130" cy="3962400"/>
-            <wp:effectExtent l="0" t="0" r="7620" b="0"/>
-            <wp:docPr id="12" name="Imagen 12"/>
+          <wp:inline distT="0" distB="0" distL="0" distR="0" wp14:anchorId="2413CE92" wp14:editId="434C10AA">
+            <wp:extent cx="5857875" cy="4069715"/>
+            <wp:effectExtent l="0" t="0" r="9525" b="6985"/>
+            <wp:docPr id="4" name="Imagen 4"/>
             <wp:cNvGraphicFramePr>
               <a:graphicFrameLocks xmlns:a="http://schemas.openxmlformats.org/drawingml/2006/main" noChangeAspect="1"/>
             </wp:cNvGraphicFramePr>
@@ -1555,11 +1346,11 @@
               <a:graphicData uri="http://schemas.openxmlformats.org/drawingml/2006/picture">
                 <pic:pic xmlns:pic="http://schemas.openxmlformats.org/drawingml/2006/picture">
                   <pic:nvPicPr>
-                    <pic:cNvPr id="12" name="Imagen 12"/>
+                    <pic:cNvPr id="4" name="Imagen 4"/>
                     <pic:cNvPicPr/>
                   </pic:nvPicPr>
                   <pic:blipFill>
-                    <a:blip r:embed="rId11" cstate="print">
+                    <a:blip r:embed="rId11">
                       <a:extLst>
                         <a:ext uri="{28A0092B-C50C-407E-A947-70E740481C1C}">
                           <a14:useLocalDpi xmlns:a14="http://schemas.microsoft.com/office/drawing/2010/main" val="0"/>
@@ -1573,7 +1364,7 @@
                   <pic:spPr>
                     <a:xfrm>
                       <a:off x="0" y="0"/>
-                      <a:ext cx="5612130" cy="3962400"/>
+                      <a:ext cx="5857875" cy="4069715"/>
                     </a:xfrm>
                     <a:prstGeom prst="rect">
                       <a:avLst/>
@@ -1592,11 +1383,12 @@
           <w:sz w:val="24"/>
           <w:szCs w:val="24"/>
         </w:rPr>
+        <w:lastRenderedPageBreak/>
         <w:drawing>
-          <wp:inline distT="0" distB="0" distL="0" distR="0" wp14:anchorId="2628A0A1" wp14:editId="7195AB3E">
-            <wp:extent cx="5612130" cy="3524250"/>
-            <wp:effectExtent l="0" t="0" r="7620" b="0"/>
-            <wp:docPr id="13" name="Imagen 13"/>
+          <wp:inline distT="0" distB="0" distL="0" distR="0" wp14:anchorId="1F030318" wp14:editId="0B6136F3">
+            <wp:extent cx="6010275" cy="3990975"/>
+            <wp:effectExtent l="0" t="0" r="9525" b="9525"/>
+            <wp:docPr id="5" name="Imagen 5"/>
             <wp:cNvGraphicFramePr>
               <a:graphicFrameLocks xmlns:a="http://schemas.openxmlformats.org/drawingml/2006/main" noChangeAspect="1"/>
             </wp:cNvGraphicFramePr>
@@ -1604,7 +1396,7 @@
               <a:graphicData uri="http://schemas.openxmlformats.org/drawingml/2006/picture">
                 <pic:pic xmlns:pic="http://schemas.openxmlformats.org/drawingml/2006/picture">
                   <pic:nvPicPr>
-                    <pic:cNvPr id="13" name="Imagen 13"/>
+                    <pic:cNvPr id="5" name="Imagen 5"/>
                     <pic:cNvPicPr/>
                   </pic:nvPicPr>
                   <pic:blipFill>
@@ -1622,7 +1414,7 @@
                   <pic:spPr>
                     <a:xfrm>
                       <a:off x="0" y="0"/>
-                      <a:ext cx="5612130" cy="3524250"/>
+                      <a:ext cx="6010275" cy="3990975"/>
                     </a:xfrm>
                     <a:prstGeom prst="rect">
                       <a:avLst/>
@@ -1634,56 +1426,6 @@
           </wp:inline>
         </w:drawing>
       </w:r>
-      <w:r>
-        <w:rPr>
-          <w:rFonts w:ascii="Times New Roman" w:hAnsi="Times New Roman" w:cs="Times New Roman"/>
-          <w:noProof/>
-          <w:sz w:val="24"/>
-          <w:szCs w:val="24"/>
-        </w:rPr>
-        <w:lastRenderedPageBreak/>
-        <w:drawing>
-          <wp:inline distT="0" distB="0" distL="0" distR="0" wp14:anchorId="44F0EDDA" wp14:editId="4CDD8CEC">
-            <wp:extent cx="5791200" cy="5010150"/>
-            <wp:effectExtent l="0" t="0" r="0" b="0"/>
-            <wp:docPr id="14" name="Imagen 14"/>
-            <wp:cNvGraphicFramePr>
-              <a:graphicFrameLocks xmlns:a="http://schemas.openxmlformats.org/drawingml/2006/main" noChangeAspect="1"/>
-            </wp:cNvGraphicFramePr>
-            <a:graphic xmlns:a="http://schemas.openxmlformats.org/drawingml/2006/main">
-              <a:graphicData uri="http://schemas.openxmlformats.org/drawingml/2006/picture">
-                <pic:pic xmlns:pic="http://schemas.openxmlformats.org/drawingml/2006/picture">
-                  <pic:nvPicPr>
-                    <pic:cNvPr id="14" name="Imagen 14"/>
-                    <pic:cNvPicPr/>
-                  </pic:nvPicPr>
-                  <pic:blipFill>
-                    <a:blip r:embed="rId13">
-                      <a:extLst>
-                        <a:ext uri="{28A0092B-C50C-407E-A947-70E740481C1C}">
-                          <a14:useLocalDpi xmlns:a14="http://schemas.microsoft.com/office/drawing/2010/main" val="0"/>
-                        </a:ext>
-                      </a:extLst>
-                    </a:blip>
-                    <a:stretch>
-                      <a:fillRect/>
-                    </a:stretch>
-                  </pic:blipFill>
-                  <pic:spPr>
-                    <a:xfrm>
-                      <a:off x="0" y="0"/>
-                      <a:ext cx="5791200" cy="5010150"/>
-                    </a:xfrm>
-                    <a:prstGeom prst="rect">
-                      <a:avLst/>
-                    </a:prstGeom>
-                  </pic:spPr>
-                </pic:pic>
-              </a:graphicData>
-            </a:graphic>
-          </wp:inline>
-        </w:drawing>
-      </w:r>
     </w:p>
     <w:p>
       <w:pPr>
@@ -1707,198 +1449,81 @@
     </w:p>
     <w:p>
       <w:pPr>
-        <w:rPr>
-          <w:rFonts w:ascii="Times New Roman" w:hAnsi="Times New Roman" w:cs="Times New Roman"/>
-          <w:sz w:val="32"/>
-          <w:szCs w:val="32"/>
-        </w:rPr>
-      </w:pPr>
-    </w:p>
-    <w:p>
-      <w:pPr>
-        <w:rPr>
-          <w:rFonts w:ascii="Times New Roman" w:hAnsi="Times New Roman" w:cs="Times New Roman"/>
-          <w:sz w:val="32"/>
-          <w:szCs w:val="32"/>
-        </w:rPr>
-      </w:pPr>
-    </w:p>
-    <w:p>
-      <w:pPr>
-        <w:rPr>
-          <w:rFonts w:ascii="Times New Roman" w:hAnsi="Times New Roman" w:cs="Times New Roman"/>
-          <w:sz w:val="32"/>
-          <w:szCs w:val="32"/>
-        </w:rPr>
-      </w:pPr>
-    </w:p>
-    <w:p>
-      <w:pPr>
-        <w:rPr>
-          <w:rFonts w:ascii="Times New Roman" w:hAnsi="Times New Roman" w:cs="Times New Roman"/>
-          <w:sz w:val="32"/>
-          <w:szCs w:val="32"/>
-        </w:rPr>
-      </w:pPr>
-    </w:p>
-    <w:p>
-      <w:pPr>
-        <w:rPr>
-          <w:rFonts w:ascii="Times New Roman" w:hAnsi="Times New Roman" w:cs="Times New Roman"/>
-          <w:sz w:val="32"/>
-          <w:szCs w:val="32"/>
-        </w:rPr>
-      </w:pPr>
-    </w:p>
-    <w:p>
-      <w:pPr>
-        <w:rPr>
-          <w:rFonts w:ascii="Times New Roman" w:hAnsi="Times New Roman" w:cs="Times New Roman"/>
-          <w:sz w:val="32"/>
-          <w:szCs w:val="32"/>
-        </w:rPr>
-      </w:pPr>
-    </w:p>
-    <w:p>
-      <w:pPr>
-        <w:rPr>
-          <w:rFonts w:ascii="Times New Roman" w:hAnsi="Times New Roman" w:cs="Times New Roman"/>
-          <w:sz w:val="32"/>
-          <w:szCs w:val="32"/>
-        </w:rPr>
-      </w:pPr>
-    </w:p>
-    <w:p>
-      <w:pPr>
-        <w:rPr>
-          <w:rFonts w:ascii="Times New Roman" w:hAnsi="Times New Roman" w:cs="Times New Roman"/>
-          <w:sz w:val="32"/>
-          <w:szCs w:val="32"/>
-        </w:rPr>
-      </w:pPr>
-    </w:p>
-    <w:p>
-      <w:pPr>
-        <w:rPr>
-          <w:rFonts w:ascii="Times New Roman" w:hAnsi="Times New Roman" w:cs="Times New Roman"/>
-          <w:sz w:val="32"/>
-          <w:szCs w:val="32"/>
-        </w:rPr>
-      </w:pPr>
-    </w:p>
-    <w:p>
-      <w:pPr>
-        <w:rPr>
-          <w:rFonts w:ascii="Times New Roman" w:hAnsi="Times New Roman" w:cs="Times New Roman"/>
-          <w:sz w:val="32"/>
-          <w:szCs w:val="32"/>
-        </w:rPr>
-      </w:pPr>
-    </w:p>
-    <w:p>
-      <w:pPr>
-        <w:rPr>
-          <w:rFonts w:ascii="Times New Roman" w:hAnsi="Times New Roman" w:cs="Times New Roman"/>
-          <w:sz w:val="32"/>
-          <w:szCs w:val="32"/>
-        </w:rPr>
-      </w:pPr>
-    </w:p>
-    <w:p>
-      <w:pPr>
-        <w:rPr>
-          <w:rFonts w:ascii="Times New Roman" w:hAnsi="Times New Roman" w:cs="Times New Roman"/>
-          <w:sz w:val="32"/>
-          <w:szCs w:val="32"/>
-        </w:rPr>
-      </w:pPr>
-    </w:p>
-    <w:p>
-      <w:pPr>
-        <w:rPr>
-          <w:rFonts w:ascii="Times New Roman" w:hAnsi="Times New Roman" w:cs="Times New Roman"/>
-          <w:sz w:val="32"/>
-          <w:szCs w:val="32"/>
-        </w:rPr>
-      </w:pPr>
-    </w:p>
-    <w:p>
-      <w:pPr>
-        <w:rPr>
-          <w:rFonts w:ascii="Times New Roman" w:hAnsi="Times New Roman" w:cs="Times New Roman"/>
-          <w:sz w:val="32"/>
-          <w:szCs w:val="32"/>
-        </w:rPr>
-      </w:pPr>
-    </w:p>
-    <w:p>
-      <w:pPr>
-        <w:rPr>
-          <w:rFonts w:ascii="Times New Roman" w:hAnsi="Times New Roman" w:cs="Times New Roman"/>
-          <w:sz w:val="32"/>
-          <w:szCs w:val="32"/>
-        </w:rPr>
-      </w:pPr>
-    </w:p>
-    <w:p>
-      <w:pPr>
-        <w:rPr>
-          <w:rFonts w:ascii="Times New Roman" w:hAnsi="Times New Roman" w:cs="Times New Roman"/>
-          <w:sz w:val="32"/>
-          <w:szCs w:val="32"/>
-        </w:rPr>
-      </w:pPr>
-    </w:p>
-    <w:p>
-      <w:pPr>
-        <w:rPr>
-          <w:rFonts w:ascii="Times New Roman" w:hAnsi="Times New Roman" w:cs="Times New Roman"/>
-          <w:sz w:val="32"/>
-          <w:szCs w:val="32"/>
-        </w:rPr>
-      </w:pPr>
-    </w:p>
-    <w:p>
-      <w:pPr>
-        <w:tabs>
-          <w:tab w:val="left" w:pos="6345"/>
-        </w:tabs>
-        <w:rPr>
-          <w:rFonts w:ascii="Times New Roman" w:hAnsi="Times New Roman" w:cs="Times New Roman"/>
-          <w:sz w:val="32"/>
-          <w:szCs w:val="32"/>
-        </w:rPr>
-      </w:pPr>
-      <w:r>
-        <w:rPr>
-          <w:rFonts w:ascii="Times New Roman" w:hAnsi="Times New Roman" w:cs="Times New Roman"/>
-          <w:sz w:val="32"/>
-          <w:szCs w:val="32"/>
-        </w:rPr>
-        <w:tab/>
-      </w:r>
-    </w:p>
-    <w:p>
-      <w:pPr>
-        <w:tabs>
-          <w:tab w:val="left" w:pos="6345"/>
-        </w:tabs>
-        <w:rPr>
-          <w:rFonts w:ascii="Times New Roman" w:hAnsi="Times New Roman" w:cs="Times New Roman"/>
-          <w:sz w:val="32"/>
-          <w:szCs w:val="32"/>
-        </w:rPr>
-      </w:pPr>
-    </w:p>
-    <w:p>
-      <w:pPr>
-        <w:tabs>
-          <w:tab w:val="left" w:pos="6345"/>
-        </w:tabs>
-        <w:rPr>
-          <w:rFonts w:ascii="Times New Roman" w:hAnsi="Times New Roman" w:cs="Times New Roman"/>
-          <w:sz w:val="32"/>
-          <w:szCs w:val="32"/>
+        <w:jc w:val="both"/>
+        <w:rPr>
+          <w:rFonts w:ascii="Times New Roman" w:hAnsi="Times New Roman" w:cs="Times New Roman"/>
+          <w:sz w:val="24"/>
+          <w:szCs w:val="24"/>
+        </w:rPr>
+      </w:pPr>
+    </w:p>
+    <w:p>
+      <w:pPr>
+        <w:jc w:val="both"/>
+        <w:rPr>
+          <w:rFonts w:ascii="Times New Roman" w:hAnsi="Times New Roman" w:cs="Times New Roman"/>
+          <w:sz w:val="24"/>
+          <w:szCs w:val="24"/>
+        </w:rPr>
+      </w:pPr>
+    </w:p>
+    <w:p>
+      <w:pPr>
+        <w:jc w:val="both"/>
+        <w:rPr>
+          <w:rFonts w:ascii="Times New Roman" w:hAnsi="Times New Roman" w:cs="Times New Roman"/>
+          <w:sz w:val="24"/>
+          <w:szCs w:val="24"/>
+        </w:rPr>
+      </w:pPr>
+    </w:p>
+    <w:p>
+      <w:pPr>
+        <w:jc w:val="both"/>
+        <w:rPr>
+          <w:rFonts w:ascii="Times New Roman" w:hAnsi="Times New Roman" w:cs="Times New Roman"/>
+          <w:sz w:val="24"/>
+          <w:szCs w:val="24"/>
+        </w:rPr>
+      </w:pPr>
+    </w:p>
+    <w:p>
+      <w:pPr>
+        <w:jc w:val="both"/>
+        <w:rPr>
+          <w:rFonts w:ascii="Times New Roman" w:hAnsi="Times New Roman" w:cs="Times New Roman"/>
+          <w:sz w:val="24"/>
+          <w:szCs w:val="24"/>
+        </w:rPr>
+      </w:pPr>
+    </w:p>
+    <w:p>
+      <w:pPr>
+        <w:jc w:val="both"/>
+        <w:rPr>
+          <w:rFonts w:ascii="Times New Roman" w:hAnsi="Times New Roman" w:cs="Times New Roman"/>
+          <w:sz w:val="24"/>
+          <w:szCs w:val="24"/>
+        </w:rPr>
+      </w:pPr>
+    </w:p>
+    <w:p>
+      <w:pPr>
+        <w:jc w:val="both"/>
+        <w:rPr>
+          <w:rFonts w:ascii="Times New Roman" w:hAnsi="Times New Roman" w:cs="Times New Roman"/>
+          <w:sz w:val="24"/>
+          <w:szCs w:val="24"/>
+        </w:rPr>
+      </w:pPr>
+    </w:p>
+    <w:p>
+      <w:pPr>
+        <w:jc w:val="both"/>
+        <w:rPr>
+          <w:rFonts w:ascii="Times New Roman" w:hAnsi="Times New Roman" w:cs="Times New Roman"/>
+          <w:sz w:val="24"/>
+          <w:szCs w:val="24"/>
         </w:rPr>
       </w:pPr>
     </w:p>

</xml_diff>

<commit_message>
se estan actualizando los casos de uso extendidos
</commit_message>
<xml_diff>
--- a/EduMultiPro 1 Parte/5) Casos de Uso EduMultiPro/uml.docx
+++ b/EduMultiPro 1 Parte/5) Casos de Uso EduMultiPro/uml.docx
@@ -1029,10 +1029,10 @@
           <w:szCs w:val="24"/>
         </w:rPr>
         <w:drawing>
-          <wp:inline distT="0" distB="0" distL="0" distR="0" wp14:anchorId="4C229D58" wp14:editId="578C2A9D">
-            <wp:extent cx="5612130" cy="4448175"/>
-            <wp:effectExtent l="0" t="0" r="7620" b="9525"/>
-            <wp:docPr id="1" name="Imagen 1"/>
+          <wp:inline distT="0" distB="0" distL="0" distR="0" wp14:anchorId="4F74F6FB" wp14:editId="655741AA">
+            <wp:extent cx="5715000" cy="5143500"/>
+            <wp:effectExtent l="0" t="0" r="0" b="0"/>
+            <wp:docPr id="6" name="Imagen 6"/>
             <wp:cNvGraphicFramePr>
               <a:graphicFrameLocks xmlns:a="http://schemas.openxmlformats.org/drawingml/2006/main" noChangeAspect="1"/>
             </wp:cNvGraphicFramePr>
@@ -1040,7 +1040,7 @@
               <a:graphicData uri="http://schemas.openxmlformats.org/drawingml/2006/picture">
                 <pic:pic xmlns:pic="http://schemas.openxmlformats.org/drawingml/2006/picture">
                   <pic:nvPicPr>
-                    <pic:cNvPr id="1" name="Imagen 1"/>
+                    <pic:cNvPr id="6" name="Imagen 6"/>
                     <pic:cNvPicPr/>
                   </pic:nvPicPr>
                   <pic:blipFill>
@@ -1058,7 +1058,7 @@
                   <pic:spPr>
                     <a:xfrm>
                       <a:off x="0" y="0"/>
-                      <a:ext cx="5612130" cy="4448175"/>
+                      <a:ext cx="5715000" cy="5143500"/>
                     </a:xfrm>
                     <a:prstGeom prst="rect">
                       <a:avLst/>
@@ -1097,42 +1097,6 @@
     </w:p>
     <w:p>
       <w:pPr>
-        <w:jc w:val="center"/>
-        <w:rPr>
-          <w:rFonts w:ascii="Times New Roman" w:hAnsi="Times New Roman" w:cs="Times New Roman"/>
-          <w:b/>
-          <w:bCs/>
-          <w:color w:val="0070C0"/>
-          <w:sz w:val="24"/>
-          <w:szCs w:val="24"/>
-        </w:rPr>
-      </w:pPr>
-    </w:p>
-    <w:p>
-      <w:pPr>
-        <w:jc w:val="center"/>
-        <w:rPr>
-          <w:rFonts w:ascii="Times New Roman" w:hAnsi="Times New Roman" w:cs="Times New Roman"/>
-          <w:b/>
-          <w:bCs/>
-          <w:color w:val="0070C0"/>
-          <w:sz w:val="24"/>
-          <w:szCs w:val="24"/>
-        </w:rPr>
-      </w:pPr>
-    </w:p>
-    <w:p>
-      <w:pPr>
-        <w:jc w:val="both"/>
-        <w:rPr>
-          <w:rFonts w:ascii="Times New Roman" w:hAnsi="Times New Roman" w:cs="Times New Roman"/>
-          <w:sz w:val="24"/>
-          <w:szCs w:val="24"/>
-        </w:rPr>
-      </w:pPr>
-    </w:p>
-    <w:p>
-      <w:pPr>
         <w:jc w:val="both"/>
         <w:rPr>
           <w:rFonts w:ascii="Times New Roman" w:hAnsi="Times New Roman" w:cs="Times New Roman"/>
@@ -1160,6 +1124,7 @@
           <w:sz w:val="44"/>
           <w:szCs w:val="44"/>
         </w:rPr>
+        <w:lastRenderedPageBreak/>
         <w:t>5.0-</w:t>
       </w:r>
       <w:r>
@@ -1226,10 +1191,10 @@
           <w:szCs w:val="24"/>
         </w:rPr>
         <w:drawing>
-          <wp:inline distT="0" distB="0" distL="0" distR="0" wp14:anchorId="00EC7A53" wp14:editId="37BECF6C">
-            <wp:extent cx="5943600" cy="5419725"/>
-            <wp:effectExtent l="0" t="0" r="0" b="9525"/>
-            <wp:docPr id="2" name="Imagen 2"/>
+          <wp:inline distT="0" distB="0" distL="0" distR="0" wp14:anchorId="780B5700" wp14:editId="6C76FD4F">
+            <wp:extent cx="5915025" cy="3752850"/>
+            <wp:effectExtent l="0" t="0" r="9525" b="0"/>
+            <wp:docPr id="7" name="Imagen 7"/>
             <wp:cNvGraphicFramePr>
               <a:graphicFrameLocks xmlns:a="http://schemas.openxmlformats.org/drawingml/2006/main" noChangeAspect="1"/>
             </wp:cNvGraphicFramePr>
@@ -1237,11 +1202,11 @@
               <a:graphicData uri="http://schemas.openxmlformats.org/drawingml/2006/picture">
                 <pic:pic xmlns:pic="http://schemas.openxmlformats.org/drawingml/2006/picture">
                   <pic:nvPicPr>
-                    <pic:cNvPr id="2" name="Imagen 2"/>
+                    <pic:cNvPr id="7" name="Imagen 7"/>
                     <pic:cNvPicPr/>
                   </pic:nvPicPr>
                   <pic:blipFill>
-                    <a:blip r:embed="rId9">
+                    <a:blip r:embed="rId9" cstate="print">
                       <a:extLst>
                         <a:ext uri="{28A0092B-C50C-407E-A947-70E740481C1C}">
                           <a14:useLocalDpi xmlns:a14="http://schemas.microsoft.com/office/drawing/2010/main" val="0"/>
@@ -1255,7 +1220,7 @@
                   <pic:spPr>
                     <a:xfrm>
                       <a:off x="0" y="0"/>
-                      <a:ext cx="5943600" cy="5419725"/>
+                      <a:ext cx="5915025" cy="3752850"/>
                     </a:xfrm>
                     <a:prstGeom prst="rect">
                       <a:avLst/>
@@ -1277,6 +1242,96 @@
           <w:szCs w:val="24"/>
         </w:rPr>
       </w:pPr>
+    </w:p>
+    <w:p>
+      <w:pPr>
+        <w:jc w:val="both"/>
+        <w:rPr>
+          <w:rFonts w:ascii="Times New Roman" w:hAnsi="Times New Roman" w:cs="Times New Roman"/>
+          <w:sz w:val="24"/>
+          <w:szCs w:val="24"/>
+        </w:rPr>
+      </w:pPr>
+    </w:p>
+    <w:p>
+      <w:pPr>
+        <w:jc w:val="both"/>
+        <w:rPr>
+          <w:rFonts w:ascii="Times New Roman" w:hAnsi="Times New Roman" w:cs="Times New Roman"/>
+          <w:sz w:val="24"/>
+          <w:szCs w:val="24"/>
+        </w:rPr>
+      </w:pPr>
+    </w:p>
+    <w:p>
+      <w:pPr>
+        <w:jc w:val="both"/>
+        <w:rPr>
+          <w:rFonts w:ascii="Times New Roman" w:hAnsi="Times New Roman" w:cs="Times New Roman"/>
+          <w:sz w:val="24"/>
+          <w:szCs w:val="24"/>
+        </w:rPr>
+      </w:pPr>
+    </w:p>
+    <w:p>
+      <w:pPr>
+        <w:jc w:val="both"/>
+        <w:rPr>
+          <w:rFonts w:ascii="Times New Roman" w:hAnsi="Times New Roman" w:cs="Times New Roman"/>
+          <w:sz w:val="24"/>
+          <w:szCs w:val="24"/>
+        </w:rPr>
+      </w:pPr>
+    </w:p>
+    <w:p>
+      <w:pPr>
+        <w:jc w:val="both"/>
+        <w:rPr>
+          <w:rFonts w:ascii="Times New Roman" w:hAnsi="Times New Roman" w:cs="Times New Roman"/>
+          <w:sz w:val="24"/>
+          <w:szCs w:val="24"/>
+        </w:rPr>
+      </w:pPr>
+    </w:p>
+    <w:p>
+      <w:pPr>
+        <w:jc w:val="both"/>
+        <w:rPr>
+          <w:rFonts w:ascii="Times New Roman" w:hAnsi="Times New Roman" w:cs="Times New Roman"/>
+          <w:sz w:val="24"/>
+          <w:szCs w:val="24"/>
+        </w:rPr>
+      </w:pPr>
+    </w:p>
+    <w:p>
+      <w:pPr>
+        <w:jc w:val="both"/>
+        <w:rPr>
+          <w:rFonts w:ascii="Times New Roman" w:hAnsi="Times New Roman" w:cs="Times New Roman"/>
+          <w:sz w:val="24"/>
+          <w:szCs w:val="24"/>
+        </w:rPr>
+      </w:pPr>
+    </w:p>
+    <w:p>
+      <w:pPr>
+        <w:jc w:val="both"/>
+        <w:rPr>
+          <w:rFonts w:ascii="Times New Roman" w:hAnsi="Times New Roman" w:cs="Times New Roman"/>
+          <w:sz w:val="24"/>
+          <w:szCs w:val="24"/>
+        </w:rPr>
+      </w:pPr>
+    </w:p>
+    <w:p>
+      <w:pPr>
+        <w:jc w:val="both"/>
+        <w:rPr>
+          <w:rFonts w:ascii="Times New Roman" w:hAnsi="Times New Roman" w:cs="Times New Roman"/>
+          <w:sz w:val="24"/>
+          <w:szCs w:val="24"/>
+        </w:rPr>
+      </w:pPr>
       <w:r>
         <w:rPr>
           <w:rFonts w:ascii="Times New Roman" w:hAnsi="Times New Roman" w:cs="Times New Roman"/>
@@ -1286,10 +1341,10 @@
         </w:rPr>
         <w:lastRenderedPageBreak/>
         <w:drawing>
-          <wp:inline distT="0" distB="0" distL="0" distR="0" wp14:anchorId="46741017" wp14:editId="2CAC4E26">
-            <wp:extent cx="5829300" cy="3562350"/>
-            <wp:effectExtent l="0" t="0" r="0" b="0"/>
-            <wp:docPr id="3" name="Imagen 3"/>
+          <wp:inline distT="0" distB="0" distL="0" distR="0" wp14:anchorId="59B0E1A9" wp14:editId="5C1C3EC6">
+            <wp:extent cx="5612130" cy="4114800"/>
+            <wp:effectExtent l="0" t="0" r="7620" b="0"/>
+            <wp:docPr id="8" name="Imagen 8"/>
             <wp:cNvGraphicFramePr>
               <a:graphicFrameLocks xmlns:a="http://schemas.openxmlformats.org/drawingml/2006/main" noChangeAspect="1"/>
             </wp:cNvGraphicFramePr>
@@ -1297,7 +1352,7 @@
               <a:graphicData uri="http://schemas.openxmlformats.org/drawingml/2006/picture">
                 <pic:pic xmlns:pic="http://schemas.openxmlformats.org/drawingml/2006/picture">
                   <pic:nvPicPr>
-                    <pic:cNvPr id="3" name="Imagen 3"/>
+                    <pic:cNvPr id="8" name="Imagen 8"/>
                     <pic:cNvPicPr/>
                   </pic:nvPicPr>
                   <pic:blipFill>
@@ -1315,7 +1370,7 @@
                   <pic:spPr>
                     <a:xfrm>
                       <a:off x="0" y="0"/>
-                      <a:ext cx="5829300" cy="3562350"/>
+                      <a:ext cx="5612130" cy="4114800"/>
                     </a:xfrm>
                     <a:prstGeom prst="rect">
                       <a:avLst/>
@@ -1327,6 +1382,16 @@
           </wp:inline>
         </w:drawing>
       </w:r>
+    </w:p>
+    <w:p>
+      <w:pPr>
+        <w:jc w:val="both"/>
+        <w:rPr>
+          <w:rFonts w:ascii="Times New Roman" w:hAnsi="Times New Roman" w:cs="Times New Roman"/>
+          <w:sz w:val="24"/>
+          <w:szCs w:val="24"/>
+        </w:rPr>
+      </w:pPr>
       <w:r>
         <w:rPr>
           <w:rFonts w:ascii="Times New Roman" w:hAnsi="Times New Roman" w:cs="Times New Roman"/>
@@ -1335,10 +1400,10 @@
           <w:szCs w:val="24"/>
         </w:rPr>
         <w:drawing>
-          <wp:inline distT="0" distB="0" distL="0" distR="0" wp14:anchorId="2413CE92" wp14:editId="434C10AA">
-            <wp:extent cx="5857875" cy="4069715"/>
-            <wp:effectExtent l="0" t="0" r="9525" b="6985"/>
-            <wp:docPr id="4" name="Imagen 4"/>
+          <wp:inline distT="0" distB="0" distL="0" distR="0" wp14:anchorId="346F2805" wp14:editId="49B8463C">
+            <wp:extent cx="5754370" cy="2857500"/>
+            <wp:effectExtent l="0" t="0" r="0" b="0"/>
+            <wp:docPr id="9" name="Imagen 9"/>
             <wp:cNvGraphicFramePr>
               <a:graphicFrameLocks xmlns:a="http://schemas.openxmlformats.org/drawingml/2006/main" noChangeAspect="1"/>
             </wp:cNvGraphicFramePr>
@@ -1346,11 +1411,11 @@
               <a:graphicData uri="http://schemas.openxmlformats.org/drawingml/2006/picture">
                 <pic:pic xmlns:pic="http://schemas.openxmlformats.org/drawingml/2006/picture">
                   <pic:nvPicPr>
-                    <pic:cNvPr id="4" name="Imagen 4"/>
+                    <pic:cNvPr id="9" name="Imagen 9"/>
                     <pic:cNvPicPr/>
                   </pic:nvPicPr>
                   <pic:blipFill>
-                    <a:blip r:embed="rId11">
+                    <a:blip r:embed="rId11" cstate="print">
                       <a:extLst>
                         <a:ext uri="{28A0092B-C50C-407E-A947-70E740481C1C}">
                           <a14:useLocalDpi xmlns:a14="http://schemas.microsoft.com/office/drawing/2010/main" val="0"/>
@@ -1364,7 +1429,7 @@
                   <pic:spPr>
                     <a:xfrm>
                       <a:off x="0" y="0"/>
-                      <a:ext cx="5857875" cy="4069715"/>
+                      <a:ext cx="5759155" cy="2859876"/>
                     </a:xfrm>
                     <a:prstGeom prst="rect">
                       <a:avLst/>
@@ -1376,6 +1441,56 @@
           </wp:inline>
         </w:drawing>
       </w:r>
+    </w:p>
+    <w:p>
+      <w:pPr>
+        <w:jc w:val="both"/>
+        <w:rPr>
+          <w:rFonts w:ascii="Times New Roman" w:hAnsi="Times New Roman" w:cs="Times New Roman"/>
+          <w:sz w:val="24"/>
+          <w:szCs w:val="24"/>
+        </w:rPr>
+      </w:pPr>
+    </w:p>
+    <w:p>
+      <w:pPr>
+        <w:jc w:val="both"/>
+        <w:rPr>
+          <w:rFonts w:ascii="Times New Roman" w:hAnsi="Times New Roman" w:cs="Times New Roman"/>
+          <w:sz w:val="24"/>
+          <w:szCs w:val="24"/>
+        </w:rPr>
+      </w:pPr>
+    </w:p>
+    <w:p>
+      <w:pPr>
+        <w:jc w:val="both"/>
+        <w:rPr>
+          <w:rFonts w:ascii="Times New Roman" w:hAnsi="Times New Roman" w:cs="Times New Roman"/>
+          <w:sz w:val="24"/>
+          <w:szCs w:val="24"/>
+        </w:rPr>
+      </w:pPr>
+    </w:p>
+    <w:p>
+      <w:pPr>
+        <w:jc w:val="both"/>
+        <w:rPr>
+          <w:rFonts w:ascii="Times New Roman" w:hAnsi="Times New Roman" w:cs="Times New Roman"/>
+          <w:sz w:val="24"/>
+          <w:szCs w:val="24"/>
+        </w:rPr>
+      </w:pPr>
+    </w:p>
+    <w:p>
+      <w:pPr>
+        <w:jc w:val="both"/>
+        <w:rPr>
+          <w:rFonts w:ascii="Times New Roman" w:hAnsi="Times New Roman" w:cs="Times New Roman"/>
+          <w:sz w:val="24"/>
+          <w:szCs w:val="24"/>
+        </w:rPr>
+      </w:pPr>
       <w:r>
         <w:rPr>
           <w:rFonts w:ascii="Times New Roman" w:hAnsi="Times New Roman" w:cs="Times New Roman"/>
@@ -1385,10 +1500,10 @@
         </w:rPr>
         <w:lastRenderedPageBreak/>
         <w:drawing>
-          <wp:inline distT="0" distB="0" distL="0" distR="0" wp14:anchorId="1F030318" wp14:editId="0B6136F3">
-            <wp:extent cx="6010275" cy="3990975"/>
-            <wp:effectExtent l="0" t="0" r="9525" b="9525"/>
-            <wp:docPr id="5" name="Imagen 5"/>
+          <wp:inline distT="0" distB="0" distL="0" distR="0" wp14:anchorId="2B0B577D" wp14:editId="178F693C">
+            <wp:extent cx="5705475" cy="3067050"/>
+            <wp:effectExtent l="0" t="0" r="9525" b="0"/>
+            <wp:docPr id="10" name="Imagen 10"/>
             <wp:cNvGraphicFramePr>
               <a:graphicFrameLocks xmlns:a="http://schemas.openxmlformats.org/drawingml/2006/main" noChangeAspect="1"/>
             </wp:cNvGraphicFramePr>
@@ -1396,7 +1511,7 @@
               <a:graphicData uri="http://schemas.openxmlformats.org/drawingml/2006/picture">
                 <pic:pic xmlns:pic="http://schemas.openxmlformats.org/drawingml/2006/picture">
                   <pic:nvPicPr>
-                    <pic:cNvPr id="5" name="Imagen 5"/>
+                    <pic:cNvPr id="10" name="Imagen 10"/>
                     <pic:cNvPicPr/>
                   </pic:nvPicPr>
                   <pic:blipFill>
@@ -1414,7 +1529,7 @@
                   <pic:spPr>
                     <a:xfrm>
                       <a:off x="0" y="0"/>
-                      <a:ext cx="6010275" cy="3990975"/>
+                      <a:ext cx="5705475" cy="3067050"/>
                     </a:xfrm>
                     <a:prstGeom prst="rect">
                       <a:avLst/>
@@ -1426,76 +1541,6 @@
           </wp:inline>
         </w:drawing>
       </w:r>
-    </w:p>
-    <w:p>
-      <w:pPr>
-        <w:jc w:val="both"/>
-        <w:rPr>
-          <w:rFonts w:ascii="Times New Roman" w:hAnsi="Times New Roman" w:cs="Times New Roman"/>
-          <w:sz w:val="24"/>
-          <w:szCs w:val="24"/>
-        </w:rPr>
-      </w:pPr>
-    </w:p>
-    <w:p>
-      <w:pPr>
-        <w:jc w:val="both"/>
-        <w:rPr>
-          <w:rFonts w:ascii="Times New Roman" w:hAnsi="Times New Roman" w:cs="Times New Roman"/>
-          <w:sz w:val="24"/>
-          <w:szCs w:val="24"/>
-        </w:rPr>
-      </w:pPr>
-    </w:p>
-    <w:p>
-      <w:pPr>
-        <w:jc w:val="both"/>
-        <w:rPr>
-          <w:rFonts w:ascii="Times New Roman" w:hAnsi="Times New Roman" w:cs="Times New Roman"/>
-          <w:sz w:val="24"/>
-          <w:szCs w:val="24"/>
-        </w:rPr>
-      </w:pPr>
-    </w:p>
-    <w:p>
-      <w:pPr>
-        <w:jc w:val="both"/>
-        <w:rPr>
-          <w:rFonts w:ascii="Times New Roman" w:hAnsi="Times New Roman" w:cs="Times New Roman"/>
-          <w:sz w:val="24"/>
-          <w:szCs w:val="24"/>
-        </w:rPr>
-      </w:pPr>
-    </w:p>
-    <w:p>
-      <w:pPr>
-        <w:jc w:val="both"/>
-        <w:rPr>
-          <w:rFonts w:ascii="Times New Roman" w:hAnsi="Times New Roman" w:cs="Times New Roman"/>
-          <w:sz w:val="24"/>
-          <w:szCs w:val="24"/>
-        </w:rPr>
-      </w:pPr>
-    </w:p>
-    <w:p>
-      <w:pPr>
-        <w:jc w:val="both"/>
-        <w:rPr>
-          <w:rFonts w:ascii="Times New Roman" w:hAnsi="Times New Roman" w:cs="Times New Roman"/>
-          <w:sz w:val="24"/>
-          <w:szCs w:val="24"/>
-        </w:rPr>
-      </w:pPr>
-    </w:p>
-    <w:p>
-      <w:pPr>
-        <w:jc w:val="both"/>
-        <w:rPr>
-          <w:rFonts w:ascii="Times New Roman" w:hAnsi="Times New Roman" w:cs="Times New Roman"/>
-          <w:sz w:val="24"/>
-          <w:szCs w:val="24"/>
-        </w:rPr>
-      </w:pPr>
     </w:p>
     <w:p>
       <w:pPr>

</xml_diff>